<commit_message>
Clean up README and add picture to report
</commit_message>
<xml_diff>
--- a/doc/Report.docx
+++ b/doc/Report.docx
@@ -31,19 +31,12 @@
     <w:p>
       <w:pPr>
         <w:rPr>
-          <w:color w:val="808080" w:themeColor="background1" w:themeShade="80"/>
-          <w:lang w:val="de-DE"/>
-        </w:rPr>
-      </w:pPr>
-      <w:r>
-        <w:rPr>
           <w:i/>
           <w:iCs/>
           <w:color w:val="808080" w:themeColor="background1" w:themeShade="80"/>
           <w:lang w:val="de-DE"/>
         </w:rPr>
-        <w:t>Luca</w:t>
-      </w:r>
+      </w:pPr>
       <w:r>
         <w:rPr>
           <w:i/>
@@ -51,28 +44,90 @@
           <w:color w:val="808080" w:themeColor="background1" w:themeShade="80"/>
           <w:lang w:val="de-DE"/>
         </w:rPr>
-        <w:t xml:space="preserve"> Delli Castelli, Michael Vogt, Kewan Marboeuf, Tizian Quinque</w:t>
-      </w:r>
-    </w:p>
-    <w:p>
-      <w:pPr>
-        <w:rPr>
+        <w:t>Luca</w:t>
+      </w:r>
+      <w:r>
+        <w:rPr>
+          <w:i/>
+          <w:iCs/>
           <w:color w:val="808080" w:themeColor="background1" w:themeShade="80"/>
           <w:lang w:val="de-DE"/>
         </w:rPr>
+        <w:t xml:space="preserve"> Delli Castelli, Michael Vogt, Kewan Marboeuf, Tizian Quinque</w:t>
+      </w:r>
+    </w:p>
+    <w:p>
+      <w:pPr>
+        <w:rPr>
+          <w:color w:val="808080" w:themeColor="background1" w:themeShade="80"/>
+          <w:lang w:val="de-DE"/>
+        </w:rPr>
+      </w:pPr>
+    </w:p>
+    <w:p>
+      <w:pPr>
+        <w:jc w:val="center"/>
+        <w:rPr>
+          <w:color w:val="808080" w:themeColor="background1" w:themeShade="80"/>
+          <w:lang w:val="de-DE"/>
+        </w:rPr>
+      </w:pPr>
+      <w:r>
+        <w:rPr>
+          <w:color w:val="808080" w:themeColor="background1" w:themeShade="80"/>
+          <w:lang w:val="de-DE"/>
+        </w:rPr>
+        <w:drawing>
+          <wp:inline distT="0" distB="0" distL="0" distR="0" wp14:anchorId="6ED3F817" wp14:editId="54E17BB9">
+            <wp:extent cx="2400635" cy="2762636"/>
+            <wp:effectExtent l="0" t="0" r="0" b="0"/>
+            <wp:docPr id="2117358872" name="Picture 1"/>
+            <wp:cNvGraphicFramePr>
+              <a:graphicFrameLocks xmlns:a="http://schemas.openxmlformats.org/drawingml/2006/main" noChangeAspect="1"/>
+            </wp:cNvGraphicFramePr>
+            <a:graphic xmlns:a="http://schemas.openxmlformats.org/drawingml/2006/main">
+              <a:graphicData uri="http://schemas.openxmlformats.org/drawingml/2006/picture">
+                <pic:pic xmlns:pic="http://schemas.openxmlformats.org/drawingml/2006/picture">
+                  <pic:nvPicPr>
+                    <pic:cNvPr id="2117358872" name=""/>
+                    <pic:cNvPicPr/>
+                  </pic:nvPicPr>
+                  <pic:blipFill>
+                    <a:blip r:embed="rId4"/>
+                    <a:stretch>
+                      <a:fillRect/>
+                    </a:stretch>
+                  </pic:blipFill>
+                  <pic:spPr>
+                    <a:xfrm>
+                      <a:off x="0" y="0"/>
+                      <a:ext cx="2400635" cy="2762636"/>
+                    </a:xfrm>
+                    <a:prstGeom prst="rect">
+                      <a:avLst/>
+                    </a:prstGeom>
+                  </pic:spPr>
+                </pic:pic>
+              </a:graphicData>
+            </a:graphic>
+          </wp:inline>
+        </w:drawing>
+      </w:r>
+    </w:p>
+    <w:p>
+      <w:pPr>
+        <w:jc w:val="center"/>
+        <w:rPr>
+          <w:color w:val="808080" w:themeColor="background1" w:themeShade="80"/>
+          <w:lang w:val="de-DE"/>
+        </w:rPr>
       </w:pPr>
     </w:p>
     <w:p>
       <w:pPr>
         <w:pStyle w:val="Heading1"/>
-        <w:rPr>
-          <w:lang w:val="de-DE"/>
-        </w:rPr>
-      </w:pPr>
-      <w:r>
-        <w:rPr>
-          <w:lang w:val="de-DE"/>
-        </w:rPr>
+      </w:pPr>
+      <w:r>
         <w:t>Motivation</w:t>
       </w:r>
     </w:p>
@@ -427,13 +482,7 @@
         <w:t xml:space="preserve"> should be used</w:t>
       </w:r>
       <w:r>
-        <w:t xml:space="preserve">. </w:t>
-      </w:r>
-      <w:r>
-        <w:t>In addition, the player can also say “exit” to stop the game.</w:t>
-      </w:r>
-      <w:r>
-        <w:t xml:space="preserve"> All of these </w:t>
+        <w:t xml:space="preserve">. In addition, the player can also say “exit” to stop the game. All of these </w:t>
       </w:r>
       <w:r>
         <w:t xml:space="preserve">are parsed using the previously explained </w:t>

</xml_diff>